<commit_message>
Rewrite the first 3 Garage Tips articles in the user's own voice
Applies the full voice profile distilled from 7 personal writing samples
(see feedback_garage_tips_voice memory): concrete specifics over abstraction,
repetition-for-emphasis, honest-acknowledge-before-pivot, "simple answer vs.
real answer" framing, short stacked sentences to land a point, rhetorical
question + terse self-answer, and light sarcasm/dry humor worked in where
it fits naturally rather than forced.

All facts, affiliate links, and photo placeholders are unchanged from the
original AI-toned drafts -- only the prose itself changed. First batch of
3, pending the user's read before running the same pass on the other 15.

Co-Authored-By: Claude Sonnet 5 <noreply@anthropic.com>
</commit_message>
<xml_diff>
--- a/Articles/02-cleaning-pitch-resin-blades/article.docx
+++ b/Articles/02-cleaning-pitch-resin-blades/article.docx
@@ -70,7 +70,7 @@
     </w:p>
     <w:p>
       <w:r>
-        <w:t xml:space="preserve">Run a fingernail across the face of a blade that's cut a few hundred feet of pine and you'll feel it — a dark, slightly tacky ridge built up right where the carbide meets the plate. That's pitch and resin, and it's doing more damage than most people realize. It's not just a cosmetic problem; it changes how the blade cuts, how hot it runs, and how it behaves the moment something binds.</w:t>
+        <w:t xml:space="preserve">Run a fingernail across the face of a blade that's cut a few hundred feet of pine, and you'll feel it before you ever see it — a dark, tacky ridge sitting right where the carbide meets the plate. That's pitch and resin. And here's the part that surprises people: it's not a cosmetic problem. It's not even really about how the blade looks. It's about how the blade cuts, how hot it runs, and how it behaves the second something binds.</w:t>
       </w:r>
     </w:p>
     <w:p>
@@ -83,7 +83,7 @@
     </w:p>
     <w:p>
       <w:r>
-        <w:t xml:space="preserve">Pitch acts as an insulating layer between the carbide tip and the wood, which sounds harmless until you think through what it actually does. First, it increases friction — the blade has to push through the cut instead of slicing, which raises cutting force and heat. Second, that extra heat has nowhere to go, because the pitch layer is also blocking the carbide from shedding heat into the airstream and sawdust the way a clean edge does. Third, and most important for safety, a gummed-up blade is more prone to binding in the kerf. A blade that binds even slightly can cause the workpiece to lift or grab, which is exactly the mechanism behind a kickback. On top of all that, a resin-coated edge dulls faster than a clean one — you're effectively cutting with a duller tool long before the carbide itself has actually worn down.</w:t>
+        <w:t xml:space="preserve">So what's actually going on under that gunk? Pitch acts like insulation between the carbide and the wood, which sounds harmless right up until you think through what insulation actually does here. First: more friction. The blade pushes through the cut instead of slicing it, so cutting force and heat both climb. Second: that heat has nowhere to go, because the same layer that's ruining your cut is also blocking the carbide from shedding heat into the airstream and sawdust the way a clean edge would. Third, and this is the one that actually matters for your safety, not just your cut quality: a gummed-up blade binds in the kerf more easily. Bind even a little, and the workpiece can lift or grab — that's exactly the mechanism behind kickback. And underneath all of it, a resin-coated edge dulls faster than a clean one. You paid for a sharp blade. Congratulations, you're now running a dull one, and the carbide itself hasn't actually worn down at all.</w:t>
       </w:r>
     </w:p>
     <w:p>
@@ -112,7 +112,7 @@
     </w:p>
     <w:p>
       <w:r>
-        <w:t xml:space="preserve">You've got two real paths here, and both work when used correctly.</w:t>
+        <w:t xml:space="preserve">You've got two real paths here, and both actually work — when you use them correctly.</w:t>
       </w:r>
     </w:p>
     <w:p>
@@ -147,7 +147,7 @@
         </w:r>
       </w:hyperlink>
       <w:r>
-        <w:t xml:space="preserve"> are formulated specifically to dissolve pitch and resin without attacking carbide braze joints, anti-stick coatings (like the black non-stick coating on many Freud and CMT blades), or aluminum router bit bodies. They're the safest default choice, especially for anything with a coating you want to preserve, and most work in 5-10 minutes without scrubbing.</w:t>
+        <w:t xml:space="preserve"> are built specifically to dissolve pitch and resin without attacking carbide braze joints, anti-stick coatings (the black non-stick finish on a lot of Freud and CMT blades), or aluminum router bit bodies. They're the safe default, especially for anything with a coating worth keeping, and most work in 5-10 minutes without any scrubbing.</w:t>
       </w:r>
     </w:p>
     <w:p>
@@ -158,7 +158,7 @@
         <w:t xml:space="preserve">Household options</w:t>
       </w:r>
       <w:r>
-        <w:t xml:space="preserve"> can work but come with real tradeoffs. Diluted </w:t>
+        <w:t xml:space="preserve"> can work, but they come with real tradeoffs. Diluted </w:t>
       </w:r>
       <w:hyperlink r:id="rIdLink2">
         <w:r>
@@ -170,7 +170,7 @@
         </w:r>
       </w:hyperlink>
       <w:r>
-        <w:t xml:space="preserve"> (roughly 1:1 with water, or straight for heavy buildup) is a solid budget option that's gentle enough for daily use and won't touch most coatings or braze joints — it's genuinely a reasonable everyday cleaner, just slower than a dedicated pitch remover on heavy buildup. Oven cleaner is the one you'll see recommended online that deserves a hard caution: it's a strong lye (sodium hydroxide) solution, and while it does cut through pitch fast, it's harsh enough to attack aluminum router bit shanks and bases, can discolor or strip anti-stick coatings, and will irritate skin and lungs without gloves and ventilation. If you use it, limit it to steel-body, uncoated blades, keep contact time short, and rinse thoroughly — but for anything with aluminum or a coated finish, skip it entirely.</w:t>
+        <w:t xml:space="preserve"> (roughly 1:1 with water, straight for heavy buildup) is a solid budget pick — gentle enough for regular use, won't touch most coatings or braze joints, genuinely fine as an everyday cleaner. Just slower than a dedicated pitch remover on the heavy stuff. Oven cleaner is the one you'll see recommended online, and it deserves a hard caution, not a shrug. Yes, it cuts through pitch fast. It's also a strong lye solution that's more than happy to eat the aluminum shank right off a router bit while it's at it, discolor or strip an anti-stick coating, and irritate your skin and lungs if you're not gloved up and ventilated. If you're still going to use it, keep it to steel-body, uncoated blades only, keep contact time short, and rinse thoroughly. Anything with aluminum or a coated finish, leave the oven cleaner in the kitchen where it belongs.</w:t>
       </w:r>
     </w:p>
     <w:p>
@@ -183,7 +183,7 @@
     </w:p>
     <w:p>
       <w:r>
-        <w:t xml:space="preserve">Once you've picked a cleaner, the actual process is the same regardless of which one:</w:t>
+        <w:t xml:space="preserve">Once you've picked a cleaner, the process is the same no matter which one you went with:</w:t>
       </w:r>
     </w:p>
     <w:p>
@@ -194,7 +194,7 @@
         <w:t xml:space="preserve">1. Lay the blade or bit flat</w:t>
       </w:r>
       <w:r>
-        <w:t xml:space="preserve"> in a shallow plastic tray or an old cake pan — never a container you'll reuse for food.</w:t>
+        <w:t xml:space="preserve"> in a shallow plastic tray or an old cake pan. Never a container you're going to reuse for food. I know it's the perfect size. No.</w:t>
       </w:r>
     </w:p>
     <w:p>
@@ -205,7 +205,7 @@
         <w:t xml:space="preserve">2. Cover it with cleaner</w:t>
       </w:r>
       <w:r>
-        <w:t xml:space="preserve"> so both faces are wetted, or spray liberally if you're using an aerosol formula.</w:t>
+        <w:t xml:space="preserve"> so both faces are wetted, or spray liberally if you're running an aerosol formula.</w:t>
       </w:r>
     </w:p>
     <w:p>
@@ -216,7 +216,7 @@
         <w:t xml:space="preserve">3. Soak 5-15 minutes.</w:t>
       </w:r>
       <w:r>
-        <w:t xml:space="preserve"> Heavier, older buildup needs the longer end of that range. Don't walk away for hours — extended soaking doesn't help much and just prolongs unnecessary chemical exposure to the metal.</w:t>
+        <w:t xml:space="preserve"> Older, heavier buildup gets the longer end of that range. Don't walk away for hours thinking more is better — it isn't. Extended soaking doesn't clean it any faster, it just prolongs chemical exposure to metal that didn't need it.</w:t>
       </w:r>
     </w:p>
     <w:p>
@@ -227,7 +227,7 @@
         <w:t xml:space="preserve">4. Brush the gullets and tooth faces</w:t>
       </w:r>
       <w:r>
-        <w:t xml:space="preserve"> with a nylon-bristle brush (an old toothbrush works) or a brass-bristle brush for stubborn spots. Brass is soft enough not to scratch carbide or steel but still has enough bite to knock resin loose.</w:t>
+        <w:t xml:space="preserve"> with a nylon-bristle brush (an old toothbrush works fine) or brass bristles for the stubborn spots. Brass is soft enough not to scratch carbide or steel, but it's still got enough bite to knock resin loose.</w:t>
       </w:r>
     </w:p>
     <w:p>
@@ -238,7 +238,7 @@
         <w:t xml:space="preserve">5. Rinse with water and dry immediately</w:t>
       </w:r>
       <w:r>
-        <w:t xml:space="preserve"> — compressed air or a clean towel, then let it air-dry fully before storage. Any leftover moisture on bare steel will flash-rust within the hour.</w:t>
+        <w:t xml:space="preserve"> — compressed air or a clean towel, then let it finish air-drying before it goes back into storage. Leftover moisture on bare steel will flash-rust within the hour. That's not a maybe.</w:t>
       </w:r>
     </w:p>
     <w:p>
@@ -249,7 +249,7 @@
         <w:t xml:space="preserve">6. Wipe on a light coat of oil</w:t>
       </w:r>
       <w:r>
-        <w:t xml:space="preserve"> before the blade goes back in the drawer or the tool goes back on the shelf. A drop of machine oil or a wipe of the same rust inhibitor you use on your cast iron top will keep it from developing surface rust between uses.</w:t>
+        <w:t xml:space="preserve"> before the blade goes back in the drawer or the tool goes back on the shelf. A drop of machine oil, or a wipe of whatever rust inhibitor you're already using on your cast iron top, keeps surface rust from showing up between uses.</w:t>
       </w:r>
     </w:p>
     <w:p>
@@ -278,7 +278,7 @@
     </w:p>
     <w:p>
       <w:r>
-        <w:t xml:space="preserve">Skip wire brushes and wire wheels entirely — steel bristles are hard enough to scratch both carbide and the anti-stick coatings that keep pitch from building up as fast in the first place, which ironically makes the next cleaning harder. Skip strong chlorinated solvents and straight acetone on coated blades and bits, since they can soften or lift the coating along with the resin. And never soak router bits or blades with bearings (guided bits, ball-bearing pilot bits) fully submerged — water and solvent that gets into the bearing race will wash out the grease and lead to a gritty, failing bearing down the line. Wipe those by hand instead, keeping liquid off the bearing itself.</w:t>
+        <w:t xml:space="preserve">Skip wire brushes and wire wheels entirely. Steel bristles are hard enough to scratch both the carbide and the anti-stick coating that was slowing down buildup in the first place — so you'd be trading a five-minute clean today for a worse one next month. Skip strong chlorinated solvents and straight acetone on coated blades and bits too; they'll soften or lift the coating right along with the resin. And never fully submerge a bit or blade that has bearings — guided bits, ball-bearing pilot bits. Solvent that gets into the bearing race washes the grease straight out, and now you've got a gritty bearing on a slow march toward failure. Wipe those by hand and keep the liquid off the bearing itself.</w:t>
       </w:r>
     </w:p>
     <w:p>
@@ -291,12 +291,12 @@
     </w:p>
     <w:p>
       <w:r>
-        <w:t xml:space="preserve">As a rule of thumb, inspect after every 4-8 hours of cutting resinous softwoods like pine, fir, or spruce, or any time you notice the saw working harder, the motor bogging on cuts that used to be easy, or a faint burning smell during otherwise normal feed rates. A quick visual check — tilt the blade toward a light and look at the gullets — takes ten seconds and tells you everything you need to know. Hardwoods and sheet goods build up pitch much more slowly, so a monthly check is usually enough there.</w:t>
-      </w:r>
-    </w:p>
-    <w:p>
-      <w:r>
-        <w:t xml:space="preserve">Keeping tabs on when each blade and bit was last cleaned is a lot easier when it's logged somewhere instead of guessed at — </w:t>
+        <w:t xml:space="preserve">Rule of thumb: check after every 4-8 hours of cutting resinous softwoods — pine, fir, spruce — or any time the saw starts working harder than it used to, the motor bogs on a cut that used to be easy, or you catch a faint burning smell at a feed rate that never smelled like anything before. A quick visual check — tilt the blade toward the light, look at the gullets — takes ten seconds and tells you everything you need to know. Hardwoods and sheet goods build up pitch a lot slower, so once a month covers it there.</w:t>
+      </w:r>
+    </w:p>
+    <w:p>
+      <w:r>
+        <w:t xml:space="preserve">Keeping track of when each blade and bit was actually last cleaned beats guessing — </w:t>
       </w:r>
       <w:hyperlink r:id="rIdLink3">
         <w:r>
@@ -308,7 +308,7 @@
         </w:r>
       </w:hyperlink>
       <w:r>
-        <w:t xml:space="preserve"> gives you a place to keep that history alongside the rest of your gear.</w:t>
+        <w:t xml:space="preserve"> gives you a place to log that history alongside the rest of your gear.</w:t>
       </w:r>
     </w:p>
     <w:sectPr>

</xml_diff>